<commit_message>
import and prepare the house price data for further analysis
</commit_message>
<xml_diff>
--- a/data_sources.docx
+++ b/data_sources.docx
@@ -62,52 +62,32 @@
       </w:r>
     </w:p>
     <w:p>
-      <w:pPr>
-        <w:rPr>
-          <w:lang w:val="pt-PT"/>
-        </w:rPr>
-      </w:pPr>
+      <w:r>
+        <w:t xml:space="preserve">House prices: </w:t>
+      </w:r>
+      <w:hyperlink r:id="rId6" w:history="1">
+        <w:r>
+          <w:rPr>
+            <w:rStyle w:val="Hyperlink"/>
+          </w:rPr>
+          <w:t>Price Paid Data - GOV.UK</w:t>
+        </w:r>
+      </w:hyperlink>
+      <w:r>
+        <w:t xml:space="preserve"> (single file, downloaded 02/12/2025)</w:t>
+      </w:r>
     </w:p>
+    <w:p/>
     <w:p>
-      <w:pPr>
-        <w:rPr>
-          <w:lang w:val="pt-PT"/>
-        </w:rPr>
-      </w:pPr>
-      <w:proofErr w:type="spellStart"/>
       <w:r>
-        <w:rPr>
-          <w:lang w:val="pt-PT"/>
-        </w:rPr>
-        <w:t>Possibly</w:t>
-      </w:r>
-      <w:proofErr w:type="spellEnd"/>
-      <w:r>
-        <w:rPr>
-          <w:lang w:val="pt-PT"/>
-        </w:rPr>
-        <w:t xml:space="preserve"> </w:t>
-      </w:r>
-      <w:proofErr w:type="spellStart"/>
-      <w:r>
-        <w:rPr>
-          <w:lang w:val="pt-PT"/>
-        </w:rPr>
-        <w:t>useful</w:t>
-      </w:r>
-      <w:proofErr w:type="spellEnd"/>
-      <w:r>
-        <w:rPr>
-          <w:lang w:val="pt-PT"/>
-        </w:rPr>
-        <w:t>:</w:t>
+        <w:t>Possibly useful:</w:t>
       </w:r>
     </w:p>
     <w:p>
       <w:r>
         <w:t xml:space="preserve">LSOA shapefile - </w:t>
       </w:r>
-      <w:hyperlink r:id="rId6" w:history="1">
+      <w:hyperlink r:id="rId7" w:history="1">
         <w:r>
           <w:rPr>
             <w:rStyle w:val="Hyperlink"/>
@@ -120,7 +100,7 @@
       <w:r>
         <w:t xml:space="preserve">MSOA shapefile - </w:t>
       </w:r>
-      <w:hyperlink r:id="rId7" w:history="1">
+      <w:hyperlink r:id="rId8" w:history="1">
         <w:r>
           <w:rPr>
             <w:rStyle w:val="Hyperlink"/>
@@ -136,7 +116,7 @@
       <w:r>
         <w:t xml:space="preserve">Ward shapefile - </w:t>
       </w:r>
-      <w:hyperlink r:id="rId8" w:history="1">
+      <w:hyperlink r:id="rId9" w:history="1">
         <w:r>
           <w:rPr>
             <w:rStyle w:val="Hyperlink"/>
@@ -761,7 +741,6 @@
   <w:style w:type="character" w:default="1" w:styleId="DefaultParagraphFont">
     <w:name w:val="Default Paragraph Font"/>
     <w:uiPriority w:val="1"/>
-    <w:semiHidden/>
     <w:unhideWhenUsed/>
   </w:style>
   <w:style w:type="table" w:default="1" w:styleId="TableNormal">

</xml_diff>

<commit_message>
beginning to introduce controls
</commit_message>
<xml_diff>
--- a/data_sources.docx
+++ b/data_sources.docx
@@ -98,9 +98,25 @@
     </w:p>
     <w:p>
       <w:r>
+        <w:t xml:space="preserve">LSOA shapefile (2011 boundaries) - </w:t>
+      </w:r>
+      <w:hyperlink r:id="rId8" w:history="1">
+        <w:r>
+          <w:rPr>
+            <w:rStyle w:val="Hyperlink"/>
+          </w:rPr>
+          <w:t>https://geoportal.statistics.gov.uk/datasets/ons::lower-layer-super-output-areas-december-2011-boundaries-ew-bfc-v3/about</w:t>
+        </w:r>
+      </w:hyperlink>
+      <w:r>
+        <w:t xml:space="preserve"> </w:t>
+      </w:r>
+    </w:p>
+    <w:p>
+      <w:r>
         <w:t xml:space="preserve">MSOA shapefile - </w:t>
       </w:r>
-      <w:hyperlink r:id="rId8" w:history="1">
+      <w:hyperlink r:id="rId9" w:history="1">
         <w:r>
           <w:rPr>
             <w:rStyle w:val="Hyperlink"/>
@@ -116,7 +132,7 @@
       <w:r>
         <w:t xml:space="preserve">Ward shapefile - </w:t>
       </w:r>
-      <w:hyperlink r:id="rId9" w:history="1">
+      <w:hyperlink r:id="rId10" w:history="1">
         <w:r>
           <w:rPr>
             <w:rStyle w:val="Hyperlink"/>
@@ -741,6 +757,7 @@
   <w:style w:type="character" w:default="1" w:styleId="DefaultParagraphFont">
     <w:name w:val="Default Paragraph Font"/>
     <w:uiPriority w:val="1"/>
+    <w:semiHidden/>
     <w:unhideWhenUsed/>
   </w:style>
   <w:style w:type="table" w:default="1" w:styleId="TableNormal">

</xml_diff>

<commit_message>
added an event study comparing red stations vs non-red
</commit_message>
<xml_diff>
--- a/data_sources.docx
+++ b/data_sources.docx
@@ -141,6 +141,82 @@
         </w:r>
       </w:hyperlink>
       <w:r>
+        <w:t xml:space="preserve"> </w:t>
+      </w:r>
+    </w:p>
+    <w:p>
+      <w:pPr>
+        <w:rPr>
+          <w:lang w:val="da-DK"/>
+        </w:rPr>
+      </w:pPr>
+      <w:r>
+        <w:rPr>
+          <w:lang w:val="da-DK"/>
+        </w:rPr>
+        <w:t xml:space="preserve">RODS/NUMBAT - </w:t>
+      </w:r>
+      <w:hyperlink r:id="rId11" w:history="1">
+        <w:r>
+          <w:rPr>
+            <w:rStyle w:val="Hyperlink"/>
+            <w:lang w:val="da-DK"/>
+          </w:rPr>
+          <w:t>https://crowding.data.tfl.gov.uk/#</w:t>
+        </w:r>
+      </w:hyperlink>
+      <w:r>
+        <w:rPr>
+          <w:lang w:val="da-DK"/>
+        </w:rPr>
+        <w:t>!</w:t>
+      </w:r>
+      <w:r>
+        <w:rPr>
+          <w:lang w:val="da-DK"/>
+        </w:rPr>
+        <w:t xml:space="preserve"> </w:t>
+      </w:r>
+    </w:p>
+    <w:p>
+      <w:pPr>
+        <w:rPr>
+          <w:lang w:val="de-DE"/>
+        </w:rPr>
+      </w:pPr>
+      <w:r>
+        <w:rPr>
+          <w:lang w:val="de-DE"/>
+        </w:rPr>
+        <w:t xml:space="preserve">Older </w:t>
+      </w:r>
+      <w:proofErr w:type="spellStart"/>
+      <w:r>
+        <w:rPr>
+          <w:lang w:val="de-DE"/>
+        </w:rPr>
+        <w:t>version</w:t>
+      </w:r>
+      <w:proofErr w:type="spellEnd"/>
+      <w:r>
+        <w:rPr>
+          <w:lang w:val="de-DE"/>
+        </w:rPr>
+        <w:t xml:space="preserve">: </w:t>
+      </w:r>
+      <w:hyperlink r:id="rId12" w:history="1">
+        <w:r>
+          <w:rPr>
+            <w:rStyle w:val="Hyperlink"/>
+            <w:lang w:val="de-DE"/>
+          </w:rPr>
+          <w:t>https://web.archive.org/web/20150322150555/http://data.tfl.gov.uk/tfl/syndication/feeds/rods.zip?app_id=&amp;app_key=</w:t>
+        </w:r>
+      </w:hyperlink>
+      <w:r>
+        <w:rPr>
+          <w:lang w:val="de-DE"/>
+        </w:rPr>
         <w:t xml:space="preserve"> </w:t>
       </w:r>
     </w:p>

</xml_diff>

<commit_message>
added control regressions with BJS
</commit_message>
<xml_diff>
--- a/data_sources.docx
+++ b/data_sources.docx
@@ -331,6 +331,34 @@
             <w:lang w:val="de-DE"/>
           </w:rPr>
           <w:t>https://www.nomisweb.co.uk/census/2011/qs117ew</w:t>
+        </w:r>
+      </w:hyperlink>
+      <w:r>
+        <w:rPr>
+          <w:lang w:val="de-DE"/>
+        </w:rPr>
+        <w:t xml:space="preserve"> </w:t>
+      </w:r>
+    </w:p>
+    <w:p>
+      <w:pPr>
+        <w:rPr>
+          <w:lang w:val="de-DE"/>
+        </w:rPr>
+      </w:pPr>
+      <w:r>
+        <w:rPr>
+          <w:lang w:val="de-DE"/>
+        </w:rPr>
+        <w:t xml:space="preserve">IMD data: </w:t>
+      </w:r>
+      <w:hyperlink r:id="rId18" w:history="1">
+        <w:r>
+          <w:rPr>
+            <w:rStyle w:val="Hyperlink"/>
+            <w:lang w:val="de-DE"/>
+          </w:rPr>
+          <w:t>https://www.gov.uk/government/statistics/english-indices-of-deprivation-2015</w:t>
         </w:r>
       </w:hyperlink>
       <w:r>

</xml_diff>